<commit_message>
docs: Add project docs, plans, and updated overview
- Foundry SDK reference, cleanup tasks, observability plan
- Updated Discovery-Bot-Overview.docx
- .gitignore: exclude build artifacts, Word lock files

Co-Authored-By: Claude Opus 4.6 <noreply@anthropic.com>
</commit_message>
<xml_diff>
--- a/Discovery-Bot-Overview.docx
+++ b/Discovery-Bot-Overview.docx
@@ -129,8 +129,134 @@
       <w:r>
         <w:t>Discovery Bot automates the extraction. It conducts structured or exploratory conversations, adapts its tone and depth to each person's role, captures every meaningful statement as a categorized knowledge item, and traces every insight back to who said it and when.</w:t>
       </w:r>
-    </w:p>
-    <w:p>
+      <w:r>
+        <w:t xml:space="preserve">  Screenshots (in order) are: Chat Page, Admin Tab, Dashboard</w:t>
+      </w:r>
+    </w:p>
+    <w:p>
+      <w:pPr>
+        <w:spacing w:after="120"/>
+      </w:pPr>
+    </w:p>
+    <w:p>
+      <w:r>
+        <w:drawing>
+          <wp:inline distT="0" distB="0" distL="0" distR="0" wp14:anchorId="568F46C2" wp14:editId="7BD8CA26">
+            <wp:extent cx="5943600" cy="3448685"/>
+            <wp:effectExtent l="0" t="0" r="0" b="0"/>
+            <wp:docPr id="1007772359" name="Picture 1" descr="A dashboard for a CFO managing a strategic transformation program, focusing on ROI, efficiency, and employee productivity.&#10;&#10;AI-generated content may be incorrect."/>
+            <wp:cNvGraphicFramePr>
+              <a:graphicFrameLocks xmlns:a="http://schemas.openxmlformats.org/drawingml/2006/main" noChangeAspect="1"/>
+            </wp:cNvGraphicFramePr>
+            <a:graphic xmlns:a="http://schemas.openxmlformats.org/drawingml/2006/main">
+              <a:graphicData uri="http://schemas.openxmlformats.org/drawingml/2006/picture">
+                <pic:pic xmlns:pic="http://schemas.openxmlformats.org/drawingml/2006/picture">
+                  <pic:nvPicPr>
+                    <pic:cNvPr id="1007772359" name="Picture 1" descr="A dashboard for a CFO managing a strategic transformation program, focusing on ROI, efficiency, and employee productivity.&#10;&#10;AI-generated content may be incorrect."/>
+                    <pic:cNvPicPr/>
+                  </pic:nvPicPr>
+                  <pic:blipFill>
+                    <a:blip r:embed="rId5"/>
+                    <a:stretch>
+                      <a:fillRect/>
+                    </a:stretch>
+                  </pic:blipFill>
+                  <pic:spPr>
+                    <a:xfrm>
+                      <a:off x="0" y="0"/>
+                      <a:ext cx="5943600" cy="3448685"/>
+                    </a:xfrm>
+                    <a:prstGeom prst="rect">
+                      <a:avLst/>
+                    </a:prstGeom>
+                  </pic:spPr>
+                </pic:pic>
+              </a:graphicData>
+            </a:graphic>
+          </wp:inline>
+        </w:drawing>
+      </w:r>
+    </w:p>
+    <w:p/>
+    <w:p>
+      <w:r>
+        <w:lastRenderedPageBreak/>
+        <w:drawing>
+          <wp:inline distT="0" distB="0" distL="0" distR="0" wp14:anchorId="58605973" wp14:editId="6A462489">
+            <wp:extent cx="5943600" cy="1339850"/>
+            <wp:effectExtent l="0" t="0" r="0" b="0"/>
+            <wp:docPr id="1886531681" name="Picture 1" descr="Refresh&#10;&#10;AI-generated content may be incorrect."/>
+            <wp:cNvGraphicFramePr>
+              <a:graphicFrameLocks xmlns:a="http://schemas.openxmlformats.org/drawingml/2006/main" noChangeAspect="1"/>
+            </wp:cNvGraphicFramePr>
+            <a:graphic xmlns:a="http://schemas.openxmlformats.org/drawingml/2006/main">
+              <a:graphicData uri="http://schemas.openxmlformats.org/drawingml/2006/picture">
+                <pic:pic xmlns:pic="http://schemas.openxmlformats.org/drawingml/2006/picture">
+                  <pic:nvPicPr>
+                    <pic:cNvPr id="1886531681" name="Picture 1" descr="Refresh&#10;&#10;AI-generated content may be incorrect."/>
+                    <pic:cNvPicPr/>
+                  </pic:nvPicPr>
+                  <pic:blipFill>
+                    <a:blip r:embed="rId6"/>
+                    <a:stretch>
+                      <a:fillRect/>
+                    </a:stretch>
+                  </pic:blipFill>
+                  <pic:spPr>
+                    <a:xfrm>
+                      <a:off x="0" y="0"/>
+                      <a:ext cx="5943600" cy="1339850"/>
+                    </a:xfrm>
+                    <a:prstGeom prst="rect">
+                      <a:avLst/>
+                    </a:prstGeom>
+                  </pic:spPr>
+                </pic:pic>
+              </a:graphicData>
+            </a:graphic>
+          </wp:inline>
+        </w:drawing>
+      </w:r>
+    </w:p>
+    <w:p/>
+    <w:p>
+      <w:r>
+        <w:drawing>
+          <wp:inline distT="0" distB="0" distL="0" distR="0" wp14:anchorId="723884DF" wp14:editId="0C939B7D">
+            <wp:extent cx="5943600" cy="4742180"/>
+            <wp:effectExtent l="0" t="0" r="0" b="1270"/>
+            <wp:docPr id="195265730" name="Picture 1" descr="The image displays a dashboard interface with various analytics and statistics, including metrics on conversations, knowledge extraction, agent quality scores, and API usage, along with numerical data and counters.&#10;&#10;AI-generated content may be incorrect."/>
+            <wp:cNvGraphicFramePr>
+              <a:graphicFrameLocks xmlns:a="http://schemas.openxmlformats.org/drawingml/2006/main" noChangeAspect="1"/>
+            </wp:cNvGraphicFramePr>
+            <a:graphic xmlns:a="http://schemas.openxmlformats.org/drawingml/2006/main">
+              <a:graphicData uri="http://schemas.openxmlformats.org/drawingml/2006/picture">
+                <pic:pic xmlns:pic="http://schemas.openxmlformats.org/drawingml/2006/picture">
+                  <pic:nvPicPr>
+                    <pic:cNvPr id="195265730" name="Picture 1" descr="The image displays a dashboard interface with various analytics and statistics, including metrics on conversations, knowledge extraction, agent quality scores, and API usage, along with numerical data and counters.&#10;&#10;AI-generated content may be incorrect."/>
+                    <pic:cNvPicPr/>
+                  </pic:nvPicPr>
+                  <pic:blipFill>
+                    <a:blip r:embed="rId7"/>
+                    <a:stretch>
+                      <a:fillRect/>
+                    </a:stretch>
+                  </pic:blipFill>
+                  <pic:spPr>
+                    <a:xfrm>
+                      <a:off x="0" y="0"/>
+                      <a:ext cx="5943600" cy="4742180"/>
+                    </a:xfrm>
+                    <a:prstGeom prst="rect">
+                      <a:avLst/>
+                    </a:prstGeom>
+                  </pic:spPr>
+                </pic:pic>
+              </a:graphicData>
+            </a:graphic>
+          </wp:inline>
+        </w:drawing>
+      </w:r>
       <w:r>
         <w:br w:type="page"/>
       </w:r>
@@ -654,15 +780,7 @@
         <w:spacing w:after="120"/>
       </w:pPr>
       <w:r>
-        <w:t xml:space="preserve">With Discovery Bot, you load a client onboarding questionnaire and discovery context, then send each stakeholder a link. The bot adapts to each person's role: the CTO gets strategic architecture questions, the security lead gets compliance </w:t>
-      </w:r>
-      <w:proofErr w:type="gramStart"/>
-      <w:r>
-        <w:t>deep-dives</w:t>
-      </w:r>
-      <w:proofErr w:type="gramEnd"/>
-      <w:r>
-        <w:t>, the dev team lead gets workflow and tooling questions. All knowledge feeds into the same knowledge base, automatically categorized and cross-referenced. Contradictions between stakeholders are flagged. By the end, you have a structured body of knowledge — not a stack of meeting notes</w:t>
+        <w:t>With Discovery Bot, you load a client onboarding questionnaire and discovery context, then send each stakeholder a link. The bot adapts to each person's role: the CTO gets strategic architecture questions, the security lead gets compliance deep-dives, the dev team lead gets workflow and tooling questions. All knowledge feeds into the same knowledge base, automatically categorized and cross-referenced. Contradictions between stakeholders are flagged. By the end, you have a structured body of knowledge — not a stack of meeting notes</w:t>
       </w:r>
       <w:r>
         <w:t>.</w:t>
@@ -682,15 +800,7 @@
         <w:spacing w:after="120"/>
       </w:pPr>
       <w:r>
-        <w:t xml:space="preserve">During </w:t>
-      </w:r>
-      <w:proofErr w:type="gramStart"/>
-      <w:r>
-        <w:t>an acquisition</w:t>
-      </w:r>
-      <w:proofErr w:type="gramEnd"/>
-      <w:r>
-        <w:t>, the technology team needs to rapidly assess the target company's infrastructure, technical debt, team capabilities, and integration complexity. Time is limited, access to people is controlled, and the questions are sensitive.</w:t>
+        <w:t>During an acquisition, the technology team needs to rapidly assess the target company's infrastructure, technical debt, team capabilities, and integration complexity. Time is limited, access to people is controlled, and the questions are sensitive.</w:t>
       </w:r>
     </w:p>
     <w:p>
@@ -715,15 +825,7 @@
         <w:spacing w:after="120"/>
       </w:pPr>
       <w:r>
-        <w:t xml:space="preserve">Before a digital transformation, ERP implementation, or process improvement initiative, organizations need to document how things </w:t>
-      </w:r>
-      <w:proofErr w:type="gramStart"/>
-      <w:r>
-        <w:t>actually work</w:t>
-      </w:r>
-      <w:proofErr w:type="gramEnd"/>
-      <w:r>
-        <w:t xml:space="preserve"> — not how the process diagram says they work. Discovery Bot can interview people across departments to capture the real workflows, workarounds, tribal knowledge, and pain points that live in people's heads. The knowledge attribution means you can trace every insight back to the source, and the categorization separates facts from opinions and requirements from concerns.</w:t>
+        <w:t>Before a digital transformation, ERP implementation, or process improvement initiative, organizations need to document how things actually work — not how the process diagram says they work. Discovery Bot can interview people across departments to capture the real workflows, workarounds, tribal knowledge, and pain points that live in people's heads. The knowledge attribution means you can trace every insight back to the source, and the categorization separates facts from opinions and requirements from concerns.</w:t>
       </w:r>
     </w:p>
     <w:p>
@@ -740,15 +842,7 @@
         <w:spacing w:after="120"/>
       </w:pPr>
       <w:r>
-        <w:t xml:space="preserve">SOC2, HIPAA, FedRAMP, and similar frameworks require evidence that specific controls are in place. Discovery Bot can walk control owners through a structured questionnaire mapped to the framework's requirements, capturing their responses as categorized knowledge items. The audit trail is built </w:t>
-      </w:r>
-      <w:proofErr w:type="gramStart"/>
-      <w:r>
-        <w:t>in:</w:t>
-      </w:r>
-      <w:proofErr w:type="gramEnd"/>
-      <w:r>
-        <w:t xml:space="preserve"> every statement traces back to who said it and when, which is exactly what auditors want to see.</w:t>
+        <w:t>SOC2, HIPAA, FedRAMP, and similar frameworks require evidence that specific controls are in place. Discovery Bot can walk control owners through a structured questionnaire mapped to the framework's requirements, capturing their responses as categorized knowledge items. The audit trail is built in: every statement traces back to who said it and when, which is exactly what auditors want to see.</w:t>
       </w:r>
     </w:p>
     <w:p>
@@ -796,15 +890,7 @@
         </w:numPr>
       </w:pPr>
       <w:r>
-        <w:t>Microsoft Foundry Agent Service (</w:t>
-      </w:r>
-      <w:proofErr w:type="gramStart"/>
-      <w:r>
-        <w:t>GA) —</w:t>
-      </w:r>
-      <w:proofErr w:type="gramEnd"/>
-      <w:r>
-        <w:t xml:space="preserve"> Responses API with versioned prompt agents</w:t>
+        <w:t>Microsoft Foundry Agent Service (GA) — Responses API with versioned prompt agents</w:t>
       </w:r>
     </w:p>
     <w:p>
@@ -816,15 +902,7 @@
         </w:numPr>
       </w:pPr>
       <w:r>
-        <w:t xml:space="preserve">Azure Functions (Flex </w:t>
-      </w:r>
-      <w:proofErr w:type="gramStart"/>
-      <w:r>
-        <w:t>Consumption) —</w:t>
-      </w:r>
-      <w:proofErr w:type="gramEnd"/>
-      <w:r>
-        <w:t xml:space="preserve"> serverless API layer</w:t>
+        <w:t>Azure Functions (Flex Consumption) — serverless API layer</w:t>
       </w:r>
     </w:p>
     <w:p>
@@ -836,15 +914,7 @@
         </w:numPr>
       </w:pPr>
       <w:r>
-        <w:t>Azure Cosmos DB (</w:t>
-      </w:r>
-      <w:proofErr w:type="gramStart"/>
-      <w:r>
-        <w:t>BYO) —</w:t>
-      </w:r>
-      <w:proofErr w:type="gramEnd"/>
-      <w:r>
-        <w:t xml:space="preserve"> conversation persistence, knowledge store, user profiles, questionnaires</w:t>
+        <w:t>Azure Cosmos DB (BYO) — conversation persistence, knowledge store, user profiles, questionnaires</w:t>
       </w:r>
     </w:p>
     <w:p>
@@ -856,15 +926,7 @@
         </w:numPr>
       </w:pPr>
       <w:r>
-        <w:t>Azure AI Search (</w:t>
-      </w:r>
-      <w:proofErr w:type="gramStart"/>
-      <w:r>
-        <w:t>BYO) —</w:t>
-      </w:r>
-      <w:proofErr w:type="gramEnd"/>
-      <w:r>
-        <w:t xml:space="preserve"> semantic search across extracted knowledge</w:t>
+        <w:t>Azure AI Search (BYO) — semantic search across extracted knowledge</w:t>
       </w:r>
     </w:p>
     <w:p>
@@ -876,15 +938,7 @@
         </w:numPr>
       </w:pPr>
       <w:r>
-        <w:t>Azure Blob Storage (</w:t>
-      </w:r>
-      <w:proofErr w:type="gramStart"/>
-      <w:r>
-        <w:t>BYO) —</w:t>
-      </w:r>
-      <w:proofErr w:type="gramEnd"/>
-      <w:r>
-        <w:t xml:space="preserve"> file uploads and document processing</w:t>
+        <w:t>Azure Blob Storage (BYO) — file uploads and document processing</w:t>
       </w:r>
     </w:p>
     <w:p>
@@ -954,15 +1008,7 @@
         <w:t xml:space="preserve">: </w:t>
       </w:r>
       <w:r>
-        <w:t xml:space="preserve">Called after every substantive user message. The agent extracts knowledge items with category, confidence score, and tags. Items are </w:t>
-      </w:r>
-      <w:proofErr w:type="gramStart"/>
-      <w:r>
-        <w:t>dual-written</w:t>
-      </w:r>
-      <w:proofErr w:type="gramEnd"/>
-      <w:r>
-        <w:t xml:space="preserve"> to Cosmos (persistence) and AI Search (retrieval).</w:t>
+        <w:t>Called after every substantive user message. The agent extracts knowledge items with category, confidence score, and tags. Items are dual-written to Cosmos (persistence) and AI Search (retrieval).</w:t>
       </w:r>
     </w:p>
     <w:p>
@@ -1059,15 +1105,7 @@
         <w:spacing w:after="120"/>
       </w:pPr>
       <w:r>
-        <w:t xml:space="preserve">Instead of writing requirements documents that go </w:t>
-      </w:r>
-      <w:proofErr w:type="gramStart"/>
-      <w:r>
-        <w:t>stale</w:t>
-      </w:r>
-      <w:proofErr w:type="gramEnd"/>
-      <w:r>
-        <w:t xml:space="preserve"> immediately, use Discovery Bot to continuously capture requirements as conversations happen. The knowledge base becomes the requirements document — always current, always attributed, always searchable. Stakeholders can add to it by talking to the bot whenever they have a new thought, not just during scheduled requirements sessions.</w:t>
+        <w:t>Instead of writing requirements documents that go stale immediately, use Discovery Bot to continuously capture requirements as conversations happen. The knowledge base becomes the requirements document — always current, always attributed, always searchable. Stakeholders can add to it by talking to the bot whenever they have a new thought, not just during scheduled requirements sessions.</w:t>
       </w:r>
     </w:p>
     <w:p>
@@ -1084,23 +1122,7 @@
         <w:spacing w:after="120"/>
       </w:pPr>
       <w:r>
-        <w:t xml:space="preserve">For consulting firms and managed service providers, Discovery Bot can serve as institutional memory for client relationships. Every discovery session, quarterly review, and strategy conversation feeds the same knowledge base. When a new team member joins the account, they can query the knowledge base instead of reading through years of meeting notes. When the client </w:t>
-      </w:r>
-      <w:proofErr w:type="gramStart"/>
-      <w:r>
-        <w:t>says</w:t>
-      </w:r>
-      <w:proofErr w:type="gramEnd"/>
-      <w:r>
-        <w:t xml:space="preserve"> 'we talked about this six months ago,' the bot can </w:t>
-      </w:r>
-      <w:proofErr w:type="gramStart"/>
-      <w:r>
-        <w:t>actually find</w:t>
-      </w:r>
-      <w:proofErr w:type="gramEnd"/>
-      <w:r>
-        <w:t xml:space="preserve"> it.</w:t>
+        <w:t>For consulting firms and managed service providers, Discovery Bot can serve as institutional memory for client relationships. Every discovery session, quarterly review, and strategy conversation feeds the same knowledge base. When a new team member joins the account, they can query the knowledge base instead of reading through years of meeting notes. When the client says 'we talked about this six months ago,' the bot can actually find it.</w:t>
       </w:r>
     </w:p>
     <w:p>
@@ -1134,15 +1156,7 @@
         <w:spacing w:after="120"/>
       </w:pPr>
       <w:r>
-        <w:t xml:space="preserve">Before a big client meeting or strategy session, send Discovery Bot to each participant with targeted questions. By the time everyone sits down in the room, the bot has already captured everyone's position, surfaced areas of agreement and disagreement, and identified the questions that </w:t>
-      </w:r>
-      <w:proofErr w:type="gramStart"/>
-      <w:r>
-        <w:t>actually need</w:t>
-      </w:r>
-      <w:proofErr w:type="gramEnd"/>
-      <w:r>
-        <w:t xml:space="preserve"> live discussion. The meeting becomes a decision-making session instead of an information-gathering one.</w:t>
+        <w:t>Before a big client meeting or strategy session, send Discovery Bot to each participant with targeted questions. By the time everyone sits down in the room, the bot has already captured everyone's position, surfaced areas of agreement and disagreement, and identified the questions that actually need live discussion. The meeting becomes a decision-making session instead of an information-gathering one.</w:t>
       </w:r>
     </w:p>
     <w:p>
@@ -1206,15 +1220,7 @@
         <w:spacing w:after="120"/>
       </w:pPr>
       <w:r>
-        <w:t xml:space="preserve">If you want structured discovery, upload a questionnaire JSON with sections and questions. The </w:t>
-      </w:r>
-      <w:proofErr w:type="gramStart"/>
-      <w:r>
-        <w:t>bot</w:t>
-      </w:r>
-      <w:proofErr w:type="gramEnd"/>
-      <w:r>
-        <w:t xml:space="preserve"> will guide the conversation through the sections while maintaining natural flow. Questionnaires go into the Cosmos questionnaires container.</w:t>
+        <w:t>If you want structured discovery, upload a questionnaire JSON with sections and questions. The bot will guide the conversation through the sections while maintaining natural flow. Questionnaires go into the Cosmos questionnaires container.</w:t>
       </w:r>
     </w:p>
     <w:p>
@@ -1239,29 +1245,16 @@
         <w:pStyle w:val="Heading2"/>
         <w:spacing w:before="300" w:after="150"/>
       </w:pPr>
-      <w:proofErr w:type="gramStart"/>
-      <w:r>
-        <w:t>Review</w:t>
-      </w:r>
-      <w:proofErr w:type="gramEnd"/>
-      <w:r>
-        <w:t xml:space="preserve"> the Knowledge Base</w:t>
-      </w:r>
-    </w:p>
-    <w:p>
-      <w:pPr>
-        <w:spacing w:after="120"/>
-      </w:pPr>
-      <w:r>
-        <w:t xml:space="preserve">Use the API or admin interface to browse, search, and export </w:t>
-      </w:r>
-      <w:proofErr w:type="gramStart"/>
-      <w:r>
-        <w:t>the captured</w:t>
-      </w:r>
-      <w:proofErr w:type="gramEnd"/>
-      <w:r>
-        <w:t xml:space="preserve"> knowledge. Filter by category, by user, by section. Look for contradictions, gaps, and patterns. Use the attribution trail to follow up on specific insights with the people who shared them.</w:t>
+      <w:r>
+        <w:t>Review the Knowledge Base</w:t>
+      </w:r>
+    </w:p>
+    <w:p>
+      <w:pPr>
+        <w:spacing w:after="120"/>
+      </w:pPr>
+      <w:r>
+        <w:t>Use the API or admin interface to browse, search, and export the captured knowledge. Filter by category, by user, by section. Look for contradictions, gaps, and patterns. Use the attribution trail to follow up on specific insights with the people who shared them.</w:t>
       </w:r>
     </w:p>
     <w:sectPr>

</xml_diff>